<commit_message>
text file convert into simple file
</commit_message>
<xml_diff>
--- a/Doc1.docx
+++ b/Doc1.docx
@@ -147,6 +147,45 @@
                     <a:xfrm>
                       <a:off x="0" y="0"/>
                       <a:ext cx="6480175" cy="2773045"/>
+                    </a:xfrm>
+                    <a:prstGeom prst="rect">
+                      <a:avLst/>
+                    </a:prstGeom>
+                  </pic:spPr>
+                </pic:pic>
+              </a:graphicData>
+            </a:graphic>
+          </wp:inline>
+        </w:drawing>
+      </w:r>
+    </w:p>
+    <w:p>
+      <w:r>
+        <w:drawing>
+          <wp:inline distT="0" distB="0" distL="0" distR="0" wp14:anchorId="3F9A406E" wp14:editId="0C6BA0E7">
+            <wp:extent cx="6480175" cy="3199765"/>
+            <wp:effectExtent l="0" t="0" r="0" b="635"/>
+            <wp:docPr id="485253951" name="Picture 1"/>
+            <wp:cNvGraphicFramePr>
+              <a:graphicFrameLocks xmlns:a="http://schemas.openxmlformats.org/drawingml/2006/main" noChangeAspect="1"/>
+            </wp:cNvGraphicFramePr>
+            <a:graphic xmlns:a="http://schemas.openxmlformats.org/drawingml/2006/main">
+              <a:graphicData uri="http://schemas.openxmlformats.org/drawingml/2006/picture">
+                <pic:pic xmlns:pic="http://schemas.openxmlformats.org/drawingml/2006/picture">
+                  <pic:nvPicPr>
+                    <pic:cNvPr id="485253951" name=""/>
+                    <pic:cNvPicPr/>
+                  </pic:nvPicPr>
+                  <pic:blipFill>
+                    <a:blip r:embed="rId8"/>
+                    <a:stretch>
+                      <a:fillRect/>
+                    </a:stretch>
+                  </pic:blipFill>
+                  <pic:spPr>
+                    <a:xfrm>
+                      <a:off x="0" y="0"/>
+                      <a:ext cx="6480175" cy="3199765"/>
                     </a:xfrm>
                     <a:prstGeom prst="rect">
                       <a:avLst/>

</xml_diff>